<commit_message>
feat: implementar CRUD completo de usuarios y productos con Sequelize (Módulo 7)
</commit_message>
<xml_diff>
--- a/docs/docs.docx
+++ b/docs/docs.docx
@@ -4,24 +4,16 @@
   <w:body>
     <w:p>
       <w:r>
+        <w:t>Modulo 6</w:t>
+      </w:r>
+    </w:p>
+    <w:p>
+      <w:r>
         <w:t>Inicialización</w:t>
       </w:r>
       <w:r>
-        <w:t xml:space="preserve"> de container con la imagen node:18-alpine y luego inicializamos el proyecto con </w:t>
-      </w:r>
-      <w:proofErr w:type="spellStart"/>
-      <w:r>
-        <w:t>node</w:t>
-      </w:r>
-      <w:proofErr w:type="spellEnd"/>
-      <w:r>
-        <w:t xml:space="preserve"> para que se cree el archivo </w:t>
-      </w:r>
-      <w:proofErr w:type="spellStart"/>
-      <w:r>
-        <w:t>package.json</w:t>
-      </w:r>
-      <w:proofErr w:type="spellEnd"/>
+        <w:t xml:space="preserve"> de container con la imagen node:18-alpine y luego inicializamos el proyecto con node para que se cree el archivo package.json</w:t>
+      </w:r>
     </w:p>
     <w:p>
       <w:r>
@@ -44,7 +36,7 @@
                     <pic:cNvPicPr/>
                   </pic:nvPicPr>
                   <pic:blipFill>
-                    <a:blip r:embed="rId4"/>
+                    <a:blip r:embed="rId6"/>
                     <a:stretch>
                       <a:fillRect/>
                     </a:stretch>
@@ -67,13 +59,8 @@
     </w:p>
     <w:p>
       <w:r>
-        <w:t xml:space="preserve">Instalación de </w:t>
-      </w:r>
-      <w:proofErr w:type="spellStart"/>
-      <w:r>
-        <w:t>express</w:t>
-      </w:r>
-      <w:proofErr w:type="spellEnd"/>
+        <w:t>Instalación de express</w:t>
+      </w:r>
     </w:p>
     <w:p>
       <w:r>
@@ -96,7 +83,7 @@
                     <pic:cNvPicPr/>
                   </pic:nvPicPr>
                   <pic:blipFill>
-                    <a:blip r:embed="rId5"/>
+                    <a:blip r:embed="rId7"/>
                     <a:stretch>
                       <a:fillRect/>
                     </a:stretch>
@@ -120,13 +107,8 @@
     <w:p/>
     <w:p>
       <w:r>
-        <w:t xml:space="preserve">Instalación de </w:t>
-      </w:r>
-      <w:proofErr w:type="spellStart"/>
-      <w:r>
-        <w:t>nodemon</w:t>
-      </w:r>
-      <w:proofErr w:type="spellEnd"/>
+        <w:t>Instalación de nodemon</w:t>
+      </w:r>
     </w:p>
     <w:p>
       <w:r>
@@ -149,7 +131,7 @@
                     <pic:cNvPicPr/>
                   </pic:nvPicPr>
                   <pic:blipFill>
-                    <a:blip r:embed="rId6"/>
+                    <a:blip r:embed="rId8"/>
                     <a:stretch>
                       <a:fillRect/>
                     </a:stretch>
@@ -194,7 +176,7 @@
                     <pic:cNvPicPr/>
                   </pic:nvPicPr>
                   <pic:blipFill>
-                    <a:blip r:embed="rId7"/>
+                    <a:blip r:embed="rId9"/>
                     <a:stretch>
                       <a:fillRect/>
                     </a:stretch>
@@ -237,7 +219,7 @@
                     <pic:cNvPicPr/>
                   </pic:nvPicPr>
                   <pic:blipFill>
-                    <a:blip r:embed="rId8"/>
+                    <a:blip r:embed="rId10"/>
                     <a:stretch>
                       <a:fillRect/>
                     </a:stretch>
@@ -282,7 +264,7 @@
                     <pic:cNvPicPr/>
                   </pic:nvPicPr>
                   <pic:blipFill>
-                    <a:blip r:embed="rId9"/>
+                    <a:blip r:embed="rId11"/>
                     <a:stretch>
                       <a:fillRect/>
                     </a:stretch>
@@ -305,15 +287,7 @@
     </w:p>
     <w:p>
       <w:r>
-        <w:t xml:space="preserve">Agregamos un </w:t>
-      </w:r>
-      <w:proofErr w:type="spellStart"/>
-      <w:r>
-        <w:t>gitignore</w:t>
-      </w:r>
-      <w:proofErr w:type="spellEnd"/>
-      <w:r>
-        <w:t xml:space="preserve"> para controlar lo que subimos al repo </w:t>
+        <w:t xml:space="preserve">Agregamos un gitignore para controlar lo que subimos al repo </w:t>
       </w:r>
     </w:p>
     <w:p>
@@ -337,7 +311,7 @@
                     <pic:cNvPicPr/>
                   </pic:nvPicPr>
                   <pic:blipFill>
-                    <a:blip r:embed="rId10"/>
+                    <a:blip r:embed="rId12"/>
                     <a:stretch>
                       <a:fillRect/>
                     </a:stretch>
@@ -360,15 +334,7 @@
     </w:p>
     <w:p>
       <w:r>
-        <w:t xml:space="preserve">Agregamos y realizamos el primer </w:t>
-      </w:r>
-      <w:proofErr w:type="spellStart"/>
-      <w:r>
-        <w:t>commit</w:t>
-      </w:r>
-      <w:proofErr w:type="spellEnd"/>
-      <w:r>
-        <w:t xml:space="preserve"> del proyecto </w:t>
+        <w:t xml:space="preserve">Agregamos y realizamos el primer commit del proyecto </w:t>
       </w:r>
       <w:r>
         <w:rPr>
@@ -390,7 +356,7 @@
                     <pic:cNvPicPr/>
                   </pic:nvPicPr>
                   <pic:blipFill>
-                    <a:blip r:embed="rId11"/>
+                    <a:blip r:embed="rId13"/>
                     <a:stretch>
                       <a:fillRect/>
                     </a:stretch>
@@ -417,19 +383,14 @@
     <w:p>
       <w:r>
         <w:lastRenderedPageBreak/>
-        <w:t xml:space="preserve">Verificar el servidor ya </w:t>
-      </w:r>
-      <w:proofErr w:type="spellStart"/>
-      <w:r>
-        <w:t>esta</w:t>
-      </w:r>
-      <w:proofErr w:type="spellEnd"/>
-      <w:r>
-        <w:t xml:space="preserve"> corriendo</w:t>
-      </w:r>
-    </w:p>
-    <w:p>
-      <w:r>
+        <w:t>Verificar el servidor ya esta corriendo</w:t>
+      </w:r>
+    </w:p>
+    <w:p>
+      <w:r>
+        <w:rPr>
+          <w:noProof/>
+        </w:rPr>
         <w:drawing>
           <wp:inline distT="0" distB="0" distL="0" distR="0" wp14:anchorId="7DF98286" wp14:editId="1F2669DE">
             <wp:extent cx="5612130" cy="1722120"/>
@@ -446,7 +407,7 @@
                     <pic:cNvPicPr/>
                   </pic:nvPicPr>
                   <pic:blipFill>
-                    <a:blip r:embed="rId12"/>
+                    <a:blip r:embed="rId14"/>
                     <a:stretch>
                       <a:fillRect/>
                     </a:stretch>
@@ -470,19 +431,14 @@
     <w:p/>
     <w:p>
       <w:r>
-        <w:t xml:space="preserve">Verificar </w:t>
-      </w:r>
-      <w:proofErr w:type="gramStart"/>
-      <w:r>
-        <w:t>el  status</w:t>
-      </w:r>
-      <w:proofErr w:type="gramEnd"/>
-      <w:r>
-        <w:t xml:space="preserve"> del servidor </w:t>
-      </w:r>
-    </w:p>
-    <w:p>
-      <w:r>
+        <w:t xml:space="preserve">Verificar el  status del servidor </w:t>
+      </w:r>
+    </w:p>
+    <w:p>
+      <w:r>
+        <w:rPr>
+          <w:noProof/>
+        </w:rPr>
         <w:drawing>
           <wp:inline distT="0" distB="0" distL="0" distR="0" wp14:anchorId="7721B490" wp14:editId="788E0E0A">
             <wp:extent cx="5612130" cy="1483995"/>
@@ -499,7 +455,7 @@
                     <pic:cNvPicPr/>
                   </pic:nvPicPr>
                   <pic:blipFill>
-                    <a:blip r:embed="rId13"/>
+                    <a:blip r:embed="rId15"/>
                     <a:stretch>
                       <a:fillRect/>
                     </a:stretch>
@@ -520,6 +476,183 @@
         </w:drawing>
       </w:r>
     </w:p>
+    <w:p/>
+    <w:p>
+      <w:r>
+        <w:t>Modulo 7</w:t>
+      </w:r>
+    </w:p>
+    <w:p>
+      <w:r>
+        <w:t xml:space="preserve">Conexión a la base de datos </w:t>
+      </w:r>
+      <w:r>
+        <w:drawing>
+          <wp:inline distT="0" distB="0" distL="0" distR="0" wp14:anchorId="16A459A8" wp14:editId="42CE925C">
+            <wp:extent cx="5612130" cy="2517140"/>
+            <wp:effectExtent l="0" t="0" r="7620" b="0"/>
+            <wp:docPr id="1343343827" name="Imagen 1"/>
+            <wp:cNvGraphicFramePr>
+              <a:graphicFrameLocks xmlns:a="http://schemas.openxmlformats.org/drawingml/2006/main" noChangeAspect="1"/>
+            </wp:cNvGraphicFramePr>
+            <a:graphic xmlns:a="http://schemas.openxmlformats.org/drawingml/2006/main">
+              <a:graphicData uri="http://schemas.openxmlformats.org/drawingml/2006/picture">
+                <pic:pic xmlns:pic="http://schemas.openxmlformats.org/drawingml/2006/picture">
+                  <pic:nvPicPr>
+                    <pic:cNvPr id="1343343827" name=""/>
+                    <pic:cNvPicPr/>
+                  </pic:nvPicPr>
+                  <pic:blipFill>
+                    <a:blip r:embed="rId16"/>
+                    <a:stretch>
+                      <a:fillRect/>
+                    </a:stretch>
+                  </pic:blipFill>
+                  <pic:spPr>
+                    <a:xfrm>
+                      <a:off x="0" y="0"/>
+                      <a:ext cx="5612130" cy="2517140"/>
+                    </a:xfrm>
+                    <a:prstGeom prst="rect">
+                      <a:avLst/>
+                    </a:prstGeom>
+                  </pic:spPr>
+                </pic:pic>
+              </a:graphicData>
+            </a:graphic>
+          </wp:inline>
+        </w:drawing>
+      </w:r>
+    </w:p>
+    <w:p/>
+    <w:p/>
+    <w:p>
+      <w:r>
+        <w:t xml:space="preserve">Tabla con datos ingresados para prueba </w:t>
+      </w:r>
+    </w:p>
+    <w:p>
+      <w:r>
+        <w:drawing>
+          <wp:inline distT="0" distB="0" distL="0" distR="0" wp14:anchorId="0CFF1E31" wp14:editId="5EF85DC4">
+            <wp:extent cx="5612130" cy="632460"/>
+            <wp:effectExtent l="0" t="0" r="7620" b="0"/>
+            <wp:docPr id="802212972" name="Imagen 1"/>
+            <wp:cNvGraphicFramePr>
+              <a:graphicFrameLocks xmlns:a="http://schemas.openxmlformats.org/drawingml/2006/main" noChangeAspect="1"/>
+            </wp:cNvGraphicFramePr>
+            <a:graphic xmlns:a="http://schemas.openxmlformats.org/drawingml/2006/main">
+              <a:graphicData uri="http://schemas.openxmlformats.org/drawingml/2006/picture">
+                <pic:pic xmlns:pic="http://schemas.openxmlformats.org/drawingml/2006/picture">
+                  <pic:nvPicPr>
+                    <pic:cNvPr id="802212972" name=""/>
+                    <pic:cNvPicPr/>
+                  </pic:nvPicPr>
+                  <pic:blipFill>
+                    <a:blip r:embed="rId17"/>
+                    <a:stretch>
+                      <a:fillRect/>
+                    </a:stretch>
+                  </pic:blipFill>
+                  <pic:spPr>
+                    <a:xfrm>
+                      <a:off x="0" y="0"/>
+                      <a:ext cx="5612130" cy="632460"/>
+                    </a:xfrm>
+                    <a:prstGeom prst="rect">
+                      <a:avLst/>
+                    </a:prstGeom>
+                  </pic:spPr>
+                </pic:pic>
+              </a:graphicData>
+            </a:graphic>
+          </wp:inline>
+        </w:drawing>
+      </w:r>
+    </w:p>
+    <w:p>
+      <w:r>
+        <w:drawing>
+          <wp:inline distT="0" distB="0" distL="0" distR="0" wp14:anchorId="77C84899" wp14:editId="5A0B2BE0">
+            <wp:extent cx="5612130" cy="1052195"/>
+            <wp:effectExtent l="0" t="0" r="7620" b="0"/>
+            <wp:docPr id="65058476" name="Imagen 1"/>
+            <wp:cNvGraphicFramePr>
+              <a:graphicFrameLocks xmlns:a="http://schemas.openxmlformats.org/drawingml/2006/main" noChangeAspect="1"/>
+            </wp:cNvGraphicFramePr>
+            <a:graphic xmlns:a="http://schemas.openxmlformats.org/drawingml/2006/main">
+              <a:graphicData uri="http://schemas.openxmlformats.org/drawingml/2006/picture">
+                <pic:pic xmlns:pic="http://schemas.openxmlformats.org/drawingml/2006/picture">
+                  <pic:nvPicPr>
+                    <pic:cNvPr id="65058476" name=""/>
+                    <pic:cNvPicPr/>
+                  </pic:nvPicPr>
+                  <pic:blipFill>
+                    <a:blip r:embed="rId18"/>
+                    <a:stretch>
+                      <a:fillRect/>
+                    </a:stretch>
+                  </pic:blipFill>
+                  <pic:spPr>
+                    <a:xfrm>
+                      <a:off x="0" y="0"/>
+                      <a:ext cx="5612130" cy="1052195"/>
+                    </a:xfrm>
+                    <a:prstGeom prst="rect">
+                      <a:avLst/>
+                    </a:prstGeom>
+                  </pic:spPr>
+                </pic:pic>
+              </a:graphicData>
+            </a:graphic>
+          </wp:inline>
+        </w:drawing>
+      </w:r>
+    </w:p>
+    <w:p>
+      <w:r>
+        <w:t xml:space="preserve">Métodos para interactuar con la base de datos desde consola para comprobar funcionalidad </w:t>
+      </w:r>
+    </w:p>
+    <w:p>
+      <w:r>
+        <w:drawing>
+          <wp:inline distT="0" distB="0" distL="0" distR="0" wp14:anchorId="59FABD7A" wp14:editId="5FDC4B19">
+            <wp:extent cx="5612130" cy="628015"/>
+            <wp:effectExtent l="0" t="0" r="7620" b="635"/>
+            <wp:docPr id="354453662" name="Imagen 1"/>
+            <wp:cNvGraphicFramePr>
+              <a:graphicFrameLocks xmlns:a="http://schemas.openxmlformats.org/drawingml/2006/main" noChangeAspect="1"/>
+            </wp:cNvGraphicFramePr>
+            <a:graphic xmlns:a="http://schemas.openxmlformats.org/drawingml/2006/main">
+              <a:graphicData uri="http://schemas.openxmlformats.org/drawingml/2006/picture">
+                <pic:pic xmlns:pic="http://schemas.openxmlformats.org/drawingml/2006/picture">
+                  <pic:nvPicPr>
+                    <pic:cNvPr id="354453662" name=""/>
+                    <pic:cNvPicPr/>
+                  </pic:nvPicPr>
+                  <pic:blipFill>
+                    <a:blip r:embed="rId19"/>
+                    <a:stretch>
+                      <a:fillRect/>
+                    </a:stretch>
+                  </pic:blipFill>
+                  <pic:spPr>
+                    <a:xfrm>
+                      <a:off x="0" y="0"/>
+                      <a:ext cx="5612130" cy="628015"/>
+                    </a:xfrm>
+                    <a:prstGeom prst="rect">
+                      <a:avLst/>
+                    </a:prstGeom>
+                  </pic:spPr>
+                </pic:pic>
+              </a:graphicData>
+            </a:graphic>
+          </wp:inline>
+        </w:drawing>
+      </w:r>
+    </w:p>
     <w:sectPr>
       <w:pgSz w:w="12240" w:h="15840"/>
       <w:pgMar w:top="1417" w:right="1701" w:bottom="1417" w:left="1701" w:header="708" w:footer="708" w:gutter="0"/>
@@ -528,6 +661,56 @@
     </w:sectPr>
   </w:body>
 </w:document>
+</file>
+
+<file path=word/endnotes.xml><?xml version="1.0" encoding="utf-8"?>
+<w:endnotes xmlns:wpc="http://schemas.microsoft.com/office/word/2010/wordprocessingCanvas" xmlns:cx="http://schemas.microsoft.com/office/drawing/2014/chartex" xmlns:cx1="http://schemas.microsoft.com/office/drawing/2015/9/8/chartex" xmlns:cx2="http://schemas.microsoft.com/office/drawing/2015/10/21/chartex" xmlns:cx3="http://schemas.microsoft.com/office/drawing/2016/5/9/chartex" xmlns:cx4="http://schemas.microsoft.com/office/drawing/2016/5/10/chartex" xmlns:cx5="http://schemas.microsoft.com/office/drawing/2016/5/11/chartex" xmlns:cx6="http://schemas.microsoft.com/office/drawing/2016/5/12/chartex" xmlns:cx7="http://schemas.microsoft.com/office/drawing/2016/5/13/chartex" xmlns:cx8="http://schemas.microsoft.com/office/drawing/2016/5/14/chartex" xmlns:mc="http://schemas.openxmlformats.org/markup-compatibility/2006" xmlns:aink="http://schemas.microsoft.com/office/drawing/2016/ink" xmlns:am3d="http://schemas.microsoft.com/office/drawing/2017/model3d" xmlns:o="urn:schemas-microsoft-com:office:office" xmlns:oel="http://schemas.microsoft.com/office/2019/extlst" xmlns:r="http://schemas.openxmlformats.org/officeDocument/2006/relationships" xmlns:m="http://schemas.openxmlformats.org/officeDocument/2006/math" xmlns:v="urn:schemas-microsoft-com:vml" xmlns:wp14="http://schemas.microsoft.com/office/word/2010/wordprocessingDrawing" xmlns:wp="http://schemas.openxmlformats.org/drawingml/2006/wordprocessingDrawing" xmlns:w10="urn:schemas-microsoft-com:office:word" xmlns:w="http://schemas.openxmlformats.org/wordprocessingml/2006/main" xmlns:w14="http://schemas.microsoft.com/office/word/2010/wordml" xmlns:w15="http://schemas.microsoft.com/office/word/2012/wordml" xmlns:w16cex="http://schemas.microsoft.com/office/word/2018/wordml/cex" xmlns:w16cid="http://schemas.microsoft.com/office/word/2016/wordml/cid" xmlns:w16="http://schemas.microsoft.com/office/word/2018/wordml" xmlns:w16du="http://schemas.microsoft.com/office/word/2023/wordml/word16du" xmlns:w16sdtdh="http://schemas.microsoft.com/office/word/2020/wordml/sdtdatahash" xmlns:w16sdtfl="http://schemas.microsoft.com/office/word/2024/wordml/sdtformatlock" xmlns:w16se="http://schemas.microsoft.com/office/word/2015/wordml/symex" xmlns:wpg="http://schemas.microsoft.com/office/word/2010/wordprocessingGroup" xmlns:wpi="http://schemas.microsoft.com/office/word/2010/wordprocessingInk" xmlns:wne="http://schemas.microsoft.com/office/word/2006/wordml" xmlns:wps="http://schemas.microsoft.com/office/word/2010/wordprocessingShape" mc:Ignorable="w14 w15 w16se w16cid w16 w16cex w16sdtdh w16sdtfl w16du wp14">
+  <w:endnote w:type="separator" w:id="-1">
+    <w:p>
+      <w:pPr>
+        <w:spacing w:after="0" w:line="240" w:lineRule="auto"/>
+      </w:pPr>
+      <w:r>
+        <w:separator/>
+      </w:r>
+    </w:p>
+  </w:endnote>
+  <w:endnote w:type="continuationSeparator" w:id="0">
+    <w:p>
+      <w:pPr>
+        <w:spacing w:after="0" w:line="240" w:lineRule="auto"/>
+      </w:pPr>
+      <w:r>
+        <w:continuationSeparator/>
+      </w:r>
+    </w:p>
+  </w:endnote>
+</w:endnotes>
+</file>
+
+<file path=word/footnotes.xml><?xml version="1.0" encoding="utf-8"?>
+<w:footnotes xmlns:wpc="http://schemas.microsoft.com/office/word/2010/wordprocessingCanvas" xmlns:cx="http://schemas.microsoft.com/office/drawing/2014/chartex" xmlns:cx1="http://schemas.microsoft.com/office/drawing/2015/9/8/chartex" xmlns:cx2="http://schemas.microsoft.com/office/drawing/2015/10/21/chartex" xmlns:cx3="http://schemas.microsoft.com/office/drawing/2016/5/9/chartex" xmlns:cx4="http://schemas.microsoft.com/office/drawing/2016/5/10/chartex" xmlns:cx5="http://schemas.microsoft.com/office/drawing/2016/5/11/chartex" xmlns:cx6="http://schemas.microsoft.com/office/drawing/2016/5/12/chartex" xmlns:cx7="http://schemas.microsoft.com/office/drawing/2016/5/13/chartex" xmlns:cx8="http://schemas.microsoft.com/office/drawing/2016/5/14/chartex" xmlns:mc="http://schemas.openxmlformats.org/markup-compatibility/2006" xmlns:aink="http://schemas.microsoft.com/office/drawing/2016/ink" xmlns:am3d="http://schemas.microsoft.com/office/drawing/2017/model3d" xmlns:o="urn:schemas-microsoft-com:office:office" xmlns:oel="http://schemas.microsoft.com/office/2019/extlst" xmlns:r="http://schemas.openxmlformats.org/officeDocument/2006/relationships" xmlns:m="http://schemas.openxmlformats.org/officeDocument/2006/math" xmlns:v="urn:schemas-microsoft-com:vml" xmlns:wp14="http://schemas.microsoft.com/office/word/2010/wordprocessingDrawing" xmlns:wp="http://schemas.openxmlformats.org/drawingml/2006/wordprocessingDrawing" xmlns:w10="urn:schemas-microsoft-com:office:word" xmlns:w="http://schemas.openxmlformats.org/wordprocessingml/2006/main" xmlns:w14="http://schemas.microsoft.com/office/word/2010/wordml" xmlns:w15="http://schemas.microsoft.com/office/word/2012/wordml" xmlns:w16cex="http://schemas.microsoft.com/office/word/2018/wordml/cex" xmlns:w16cid="http://schemas.microsoft.com/office/word/2016/wordml/cid" xmlns:w16="http://schemas.microsoft.com/office/word/2018/wordml" xmlns:w16du="http://schemas.microsoft.com/office/word/2023/wordml/word16du" xmlns:w16sdtdh="http://schemas.microsoft.com/office/word/2020/wordml/sdtdatahash" xmlns:w16sdtfl="http://schemas.microsoft.com/office/word/2024/wordml/sdtformatlock" xmlns:w16se="http://schemas.microsoft.com/office/word/2015/wordml/symex" xmlns:wpg="http://schemas.microsoft.com/office/word/2010/wordprocessingGroup" xmlns:wpi="http://schemas.microsoft.com/office/word/2010/wordprocessingInk" xmlns:wne="http://schemas.microsoft.com/office/word/2006/wordml" xmlns:wps="http://schemas.microsoft.com/office/word/2010/wordprocessingShape" mc:Ignorable="w14 w15 w16se w16cid w16 w16cex w16sdtdh w16sdtfl w16du wp14">
+  <w:footnote w:type="separator" w:id="-1">
+    <w:p>
+      <w:pPr>
+        <w:spacing w:after="0" w:line="240" w:lineRule="auto"/>
+      </w:pPr>
+      <w:r>
+        <w:separator/>
+      </w:r>
+    </w:p>
+  </w:footnote>
+  <w:footnote w:type="continuationSeparator" w:id="0">
+    <w:p>
+      <w:pPr>
+        <w:spacing w:after="0" w:line="240" w:lineRule="auto"/>
+      </w:pPr>
+      <w:r>
+        <w:continuationSeparator/>
+      </w:r>
+    </w:p>
+  </w:footnote>
+</w:footnotes>
 </file>
 
 <file path=word/styles.xml><?xml version="1.0" encoding="utf-8"?>
@@ -1447,6 +1630,50 @@
       <w:spacing w:val="5"/>
     </w:rPr>
   </w:style>
+  <w:style w:type="paragraph" w:styleId="Encabezado">
+    <w:name w:val="header"/>
+    <w:basedOn w:val="Normal"/>
+    <w:link w:val="EncabezadoCar"/>
+    <w:uiPriority w:val="99"/>
+    <w:unhideWhenUsed/>
+    <w:rsid w:val="0055443F"/>
+    <w:pPr>
+      <w:tabs>
+        <w:tab w:val="center" w:pos="4419"/>
+        <w:tab w:val="right" w:pos="8838"/>
+      </w:tabs>
+      <w:spacing w:after="0" w:line="240" w:lineRule="auto"/>
+    </w:pPr>
+  </w:style>
+  <w:style w:type="character" w:customStyle="1" w:styleId="EncabezadoCar">
+    <w:name w:val="Encabezado Car"/>
+    <w:basedOn w:val="Fuentedeprrafopredeter"/>
+    <w:link w:val="Encabezado"/>
+    <w:uiPriority w:val="99"/>
+    <w:rsid w:val="0055443F"/>
+  </w:style>
+  <w:style w:type="paragraph" w:styleId="Piedepgina">
+    <w:name w:val="footer"/>
+    <w:basedOn w:val="Normal"/>
+    <w:link w:val="PiedepginaCar"/>
+    <w:uiPriority w:val="99"/>
+    <w:unhideWhenUsed/>
+    <w:rsid w:val="0055443F"/>
+    <w:pPr>
+      <w:tabs>
+        <w:tab w:val="center" w:pos="4419"/>
+        <w:tab w:val="right" w:pos="8838"/>
+      </w:tabs>
+      <w:spacing w:after="0" w:line="240" w:lineRule="auto"/>
+    </w:pPr>
+  </w:style>
+  <w:style w:type="character" w:customStyle="1" w:styleId="PiedepginaCar">
+    <w:name w:val="Pie de página Car"/>
+    <w:basedOn w:val="Fuentedeprrafopredeter"/>
+    <w:link w:val="Piedepgina"/>
+    <w:uiPriority w:val="99"/>
+    <w:rsid w:val="0055443F"/>
+  </w:style>
 </w:styles>
 </file>
 

</xml_diff>